<commit_message>
almost done presentation for predefence
</commit_message>
<xml_diff>
--- a/documentation/Постановка задачи (ПрИС).docx
+++ b/documentation/Постановка задачи (ПрИС).docx
@@ -465,20 +465,7 @@
           <w:szCs w:val="28"/>
           <w:lang w:val="ru-RU"/>
         </w:rPr>
-        <w:t xml:space="preserve">PBAC (Policy-Based Access Control), архитектурный стиль, при котором точка принятия решения </w:t>
-      </w:r>
-      <w:bookmarkStart w:id="0" w:name="_GoBack"/>
-      <w:bookmarkEnd w:id="0"/>
-      <w:r>
-        <w:rPr>
-          <w:rFonts w:hint="default" w:ascii="Times New Roman Regular" w:hAnsi="Times New Roman Regular" w:cs="Times New Roman Regular"/>
-          <w:i w:val="0"/>
-          <w:iCs w:val="0"/>
-          <w:sz w:val="28"/>
-          <w:szCs w:val="28"/>
-          <w:lang w:val="ru-RU"/>
-        </w:rPr>
-        <w:t>и точка применения политики разделяются, в данном случае на сервер (принятие решения) и хост-</w:t>
+        <w:t>PBAC (Policy-Based Access Control), архитектурный стиль, при котором точка принятия решения и точка применения политики разделяются, в данном случае на сервер (принятие решения) и хост-</w:t>
       </w:r>
       <w:r>
         <w:rPr>
@@ -529,6 +516,7 @@
       <w:pPr>
         <w:pStyle w:val="8"/>
         <w:numPr>
+          <w:ilvl w:val="0"/>
           <w:numId w:val="0"/>
         </w:numPr>
         <w:tabs>
@@ -639,6 +627,7 @@
       <w:pPr>
         <w:pStyle w:val="8"/>
         <w:numPr>
+          <w:ilvl w:val="0"/>
           <w:numId w:val="0"/>
         </w:numPr>
         <w:tabs>
@@ -771,6 +760,7 @@
       <w:pPr>
         <w:pStyle w:val="8"/>
         <w:numPr>
+          <w:ilvl w:val="0"/>
           <w:numId w:val="0"/>
         </w:numPr>
         <w:tabs>
@@ -1266,7 +1256,9 @@
         </w:tblBorders>
         <w:tblLayout w:type="autofit"/>
         <w:tblCellMar>
+          <w:top w:w="0" w:type="dxa"/>
           <w:left w:w="108" w:type="dxa"/>
+          <w:bottom w:w="0" w:type="dxa"/>
           <w:right w:w="108" w:type="dxa"/>
         </w:tblCellMar>
       </w:tblPr>
@@ -1550,13 +1542,356 @@
           <w:iCs/>
           <w:sz w:val="28"/>
           <w:szCs w:val="28"/>
-        </w:rPr>
-        <w:br w:type="page"/>
-      </w:r>
+          <w:lang w:val="ru-RU"/>
+        </w:rPr>
+        <w:drawing>
+          <wp:inline distT="0" distB="0" distL="114300" distR="114300">
+            <wp:extent cx="5935345" cy="2971800"/>
+            <wp:effectExtent l="0" t="0" r="8255" b="0"/>
+            <wp:docPr id="1" name="Picture 1" descr="use_case_diagram"/>
+            <wp:cNvGraphicFramePr>
+              <a:graphicFrameLocks xmlns:a="http://schemas.openxmlformats.org/drawingml/2006/main" noChangeAspect="1"/>
+            </wp:cNvGraphicFramePr>
+            <a:graphic xmlns:a="http://schemas.openxmlformats.org/drawingml/2006/main">
+              <a:graphicData uri="http://schemas.openxmlformats.org/drawingml/2006/picture">
+                <pic:pic xmlns:pic="http://schemas.openxmlformats.org/drawingml/2006/picture">
+                  <pic:nvPicPr>
+                    <pic:cNvPr id="1" name="Picture 1" descr="use_case_diagram"/>
+                    <pic:cNvPicPr>
+                      <a:picLocks noChangeAspect="1"/>
+                    </pic:cNvPicPr>
+                  </pic:nvPicPr>
+                  <pic:blipFill>
+                    <a:blip r:embed="rId6"/>
+                    <a:stretch>
+                      <a:fillRect/>
+                    </a:stretch>
+                  </pic:blipFill>
+                  <pic:spPr>
+                    <a:xfrm>
+                      <a:off x="0" y="0"/>
+                      <a:ext cx="5935345" cy="2971800"/>
+                    </a:xfrm>
+                    <a:prstGeom prst="rect">
+                      <a:avLst/>
+                    </a:prstGeom>
+                  </pic:spPr>
+                </pic:pic>
+              </a:graphicData>
+            </a:graphic>
+          </wp:inline>
+        </w:drawing>
+      </w:r>
+    </w:p>
+    <w:p>
+      <w:pPr>
+        <w:keepNext w:val="0"/>
+        <w:keepLines w:val="0"/>
+        <w:pageBreakBefore w:val="0"/>
+        <w:widowControl/>
+        <w:kinsoku/>
+        <w:wordWrap/>
+        <w:overflowPunct/>
+        <w:topLinePunct w:val="0"/>
+        <w:autoSpaceDE/>
+        <w:autoSpaceDN/>
+        <w:bidi w:val="0"/>
+        <w:adjustRightInd/>
+        <w:snapToGrid/>
+        <w:spacing w:before="0" w:after="160"/>
+        <w:jc w:val="center"/>
+        <w:textAlignment w:val="auto"/>
+        <w:rPr>
+          <w:rFonts w:hint="default" w:ascii="Times New Roman" w:hAnsi="Times New Roman" w:eastAsia="SimSun" w:cs="Times New Roman"/>
+          <w:b w:val="0"/>
+          <w:bCs w:val="0"/>
+          <w:i w:val="0"/>
+          <w:iCs w:val="0"/>
+          <w:color w:val="000000"/>
+          <w:kern w:val="2"/>
+          <w:sz w:val="28"/>
+          <w:szCs w:val="28"/>
+          <w:shd w:val="clear" w:fill="FFFFFF"/>
+          <w:lang w:val="ru-RU" w:eastAsia="zh-CN" w:bidi="ar"/>
+        </w:rPr>
+      </w:pPr>
+      <w:r>
+        <w:rPr>
+          <w:rFonts w:hint="default" w:ascii="Times New Roman" w:hAnsi="Times New Roman" w:cs="Times New Roman"/>
+          <w:b w:val="0"/>
+          <w:bCs w:val="0"/>
+          <w:i w:val="0"/>
+          <w:iCs w:val="0"/>
+          <w:sz w:val="28"/>
+          <w:szCs w:val="28"/>
+          <w:lang w:val="ru-RU"/>
+        </w:rPr>
+        <w:t xml:space="preserve">Рисунок 1 </w:t>
+      </w:r>
+      <w:r>
+        <w:rPr>
+          <w:rFonts w:hint="default" w:ascii="Times New Roman" w:hAnsi="Times New Roman" w:eastAsia="SimSun" w:cs="Times New Roman"/>
+          <w:b w:val="0"/>
+          <w:bCs w:val="0"/>
+          <w:i w:val="0"/>
+          <w:iCs w:val="0"/>
+          <w:color w:val="000000"/>
+          <w:kern w:val="2"/>
+          <w:sz w:val="28"/>
+          <w:szCs w:val="28"/>
+          <w:shd w:val="clear" w:fill="FFFFFF"/>
+          <w:lang w:val="en-US" w:eastAsia="zh-CN" w:bidi="ar"/>
+        </w:rPr>
+        <w:t xml:space="preserve">– </w:t>
+      </w:r>
+      <w:r>
+        <w:rPr>
+          <w:rFonts w:hint="default" w:ascii="Times New Roman" w:hAnsi="Times New Roman" w:eastAsia="SimSun" w:cs="Times New Roman"/>
+          <w:b w:val="0"/>
+          <w:bCs w:val="0"/>
+          <w:i w:val="0"/>
+          <w:iCs w:val="0"/>
+          <w:color w:val="000000"/>
+          <w:kern w:val="2"/>
+          <w:sz w:val="28"/>
+          <w:szCs w:val="28"/>
+          <w:shd w:val="clear" w:fill="FFFFFF"/>
+          <w:lang w:val="ru-RU" w:eastAsia="zh-CN" w:bidi="ar"/>
+        </w:rPr>
+        <w:t>Диаграмма прецедентов</w:t>
+      </w:r>
+    </w:p>
+    <w:p>
+      <w:pPr>
+        <w:jc w:val="center"/>
+        <w:rPr>
+          <w:rFonts w:hint="default" w:ascii="Times New Roman" w:hAnsi="Times New Roman" w:eastAsia="SimSun" w:cs="Times New Roman"/>
+          <w:b w:val="0"/>
+          <w:bCs w:val="0"/>
+          <w:i w:val="0"/>
+          <w:iCs w:val="0"/>
+          <w:color w:val="000000"/>
+          <w:kern w:val="2"/>
+          <w:sz w:val="28"/>
+          <w:szCs w:val="28"/>
+          <w:shd w:val="clear" w:fill="FFFFFF"/>
+          <w:lang w:val="ru-RU" w:eastAsia="zh-CN" w:bidi="ar"/>
+        </w:rPr>
+      </w:pPr>
+      <w:r>
+        <w:rPr>
+          <w:rFonts w:hint="default" w:ascii="Times New Roman" w:hAnsi="Times New Roman" w:eastAsia="SimSun" w:cs="Times New Roman"/>
+          <w:b w:val="0"/>
+          <w:bCs w:val="0"/>
+          <w:i w:val="0"/>
+          <w:iCs w:val="0"/>
+          <w:color w:val="000000"/>
+          <w:kern w:val="2"/>
+          <w:sz w:val="28"/>
+          <w:szCs w:val="28"/>
+          <w:shd w:val="clear" w:fill="FFFFFF"/>
+          <w:lang w:val="ru-RU" w:eastAsia="zh-CN" w:bidi="ar"/>
+        </w:rPr>
+        <w:drawing>
+          <wp:inline distT="0" distB="0" distL="114300" distR="114300">
+            <wp:extent cx="3310255" cy="2834640"/>
+            <wp:effectExtent l="0" t="0" r="17145" b="9525"/>
+            <wp:docPr id="2" name="Picture 2" descr="idef0_get_decision"/>
+            <wp:cNvGraphicFramePr>
+              <a:graphicFrameLocks xmlns:a="http://schemas.openxmlformats.org/drawingml/2006/main" noChangeAspect="1"/>
+            </wp:cNvGraphicFramePr>
+            <a:graphic xmlns:a="http://schemas.openxmlformats.org/drawingml/2006/main">
+              <a:graphicData uri="http://schemas.openxmlformats.org/drawingml/2006/picture">
+                <pic:pic xmlns:pic="http://schemas.openxmlformats.org/drawingml/2006/picture">
+                  <pic:nvPicPr>
+                    <pic:cNvPr id="2" name="Picture 2" descr="idef0_get_decision"/>
+                    <pic:cNvPicPr>
+                      <a:picLocks noChangeAspect="1"/>
+                    </pic:cNvPicPr>
+                  </pic:nvPicPr>
+                  <pic:blipFill>
+                    <a:blip r:embed="rId7"/>
+                    <a:stretch>
+                      <a:fillRect/>
+                    </a:stretch>
+                  </pic:blipFill>
+                  <pic:spPr>
+                    <a:xfrm>
+                      <a:off x="0" y="0"/>
+                      <a:ext cx="3310255" cy="2834640"/>
+                    </a:xfrm>
+                    <a:prstGeom prst="rect">
+                      <a:avLst/>
+                    </a:prstGeom>
+                  </pic:spPr>
+                </pic:pic>
+              </a:graphicData>
+            </a:graphic>
+          </wp:inline>
+        </w:drawing>
+      </w:r>
+    </w:p>
+    <w:p>
+      <w:pPr>
+        <w:keepNext w:val="0"/>
+        <w:keepLines w:val="0"/>
+        <w:pageBreakBefore w:val="0"/>
+        <w:widowControl/>
+        <w:kinsoku/>
+        <w:wordWrap/>
+        <w:overflowPunct/>
+        <w:topLinePunct w:val="0"/>
+        <w:autoSpaceDE/>
+        <w:autoSpaceDN/>
+        <w:bidi w:val="0"/>
+        <w:adjustRightInd/>
+        <w:snapToGrid/>
+        <w:spacing w:before="0" w:after="160"/>
+        <w:jc w:val="center"/>
+        <w:textAlignment w:val="auto"/>
+        <w:rPr>
+          <w:rFonts w:hint="default" w:ascii="Times New Roman" w:hAnsi="Times New Roman" w:eastAsia="SimSun" w:cs="Times New Roman"/>
+          <w:b w:val="0"/>
+          <w:bCs w:val="0"/>
+          <w:i w:val="0"/>
+          <w:iCs w:val="0"/>
+          <w:color w:val="000000"/>
+          <w:kern w:val="2"/>
+          <w:sz w:val="28"/>
+          <w:szCs w:val="28"/>
+          <w:shd w:val="clear" w:fill="FFFFFF"/>
+          <w:lang w:val="ru-RU" w:eastAsia="zh-CN" w:bidi="ar"/>
+        </w:rPr>
+      </w:pPr>
+      <w:r>
+        <w:rPr>
+          <w:rFonts w:hint="default" w:ascii="Times New Roman" w:hAnsi="Times New Roman" w:cs="Times New Roman"/>
+          <w:b w:val="0"/>
+          <w:bCs w:val="0"/>
+          <w:i w:val="0"/>
+          <w:iCs w:val="0"/>
+          <w:sz w:val="28"/>
+          <w:szCs w:val="28"/>
+          <w:lang w:val="ru-RU"/>
+        </w:rPr>
+        <w:t xml:space="preserve">Рисунок </w:t>
+      </w:r>
+      <w:r>
+        <w:rPr>
+          <w:rFonts w:hint="default" w:cs="Times New Roman"/>
+          <w:b w:val="0"/>
+          <w:bCs w:val="0"/>
+          <w:i w:val="0"/>
+          <w:iCs w:val="0"/>
+          <w:sz w:val="28"/>
+          <w:szCs w:val="28"/>
+          <w:lang w:val="ru-RU"/>
+        </w:rPr>
+        <w:t>2</w:t>
+      </w:r>
+      <w:r>
+        <w:rPr>
+          <w:rFonts w:hint="default" w:ascii="Times New Roman" w:hAnsi="Times New Roman" w:cs="Times New Roman"/>
+          <w:b w:val="0"/>
+          <w:bCs w:val="0"/>
+          <w:i w:val="0"/>
+          <w:iCs w:val="0"/>
+          <w:sz w:val="28"/>
+          <w:szCs w:val="28"/>
+          <w:lang w:val="ru-RU"/>
+        </w:rPr>
+        <w:t xml:space="preserve"> </w:t>
+      </w:r>
+      <w:r>
+        <w:rPr>
+          <w:rFonts w:hint="default" w:ascii="Times New Roman" w:hAnsi="Times New Roman" w:eastAsia="SimSun" w:cs="Times New Roman"/>
+          <w:b w:val="0"/>
+          <w:bCs w:val="0"/>
+          <w:i w:val="0"/>
+          <w:iCs w:val="0"/>
+          <w:color w:val="000000"/>
+          <w:kern w:val="2"/>
+          <w:sz w:val="28"/>
+          <w:szCs w:val="28"/>
+          <w:shd w:val="clear" w:fill="FFFFFF"/>
+          <w:lang w:val="en-US" w:eastAsia="zh-CN" w:bidi="ar"/>
+        </w:rPr>
+        <w:t>–</w:t>
+      </w:r>
+      <w:r>
+        <w:rPr>
+          <w:rFonts w:hint="default" w:eastAsia="SimSun" w:cs="Times New Roman"/>
+          <w:b w:val="0"/>
+          <w:bCs w:val="0"/>
+          <w:i w:val="0"/>
+          <w:iCs w:val="0"/>
+          <w:color w:val="000000"/>
+          <w:kern w:val="2"/>
+          <w:sz w:val="28"/>
+          <w:szCs w:val="28"/>
+          <w:shd w:val="clear" w:fill="FFFFFF"/>
+          <w:lang w:val="ru-RU" w:eastAsia="zh-CN" w:bidi="ar"/>
+        </w:rPr>
+        <w:t xml:space="preserve"> Диаграмма</w:t>
+      </w:r>
+      <w:r>
+        <w:rPr>
+          <w:rFonts w:hint="default" w:ascii="Times New Roman" w:hAnsi="Times New Roman" w:eastAsia="SimSun" w:cs="Times New Roman"/>
+          <w:b w:val="0"/>
+          <w:bCs w:val="0"/>
+          <w:i w:val="0"/>
+          <w:iCs w:val="0"/>
+          <w:color w:val="000000"/>
+          <w:kern w:val="2"/>
+          <w:sz w:val="28"/>
+          <w:szCs w:val="28"/>
+          <w:shd w:val="clear" w:fill="FFFFFF"/>
+          <w:lang w:val="en-US" w:eastAsia="zh-CN" w:bidi="ar"/>
+        </w:rPr>
+        <w:t xml:space="preserve"> </w:t>
+      </w:r>
+      <w:r>
+        <w:rPr>
+          <w:rFonts w:hint="default" w:eastAsia="SimSun" w:cs="Times New Roman"/>
+          <w:b w:val="0"/>
+          <w:bCs w:val="0"/>
+          <w:i w:val="0"/>
+          <w:iCs w:val="0"/>
+          <w:color w:val="000000"/>
+          <w:kern w:val="2"/>
+          <w:sz w:val="28"/>
+          <w:szCs w:val="28"/>
+          <w:shd w:val="clear" w:fill="FFFFFF"/>
+          <w:lang w:val="en-US" w:eastAsia="zh-CN" w:bidi="ar"/>
+        </w:rPr>
+        <w:t>IDEF</w:t>
+      </w:r>
+      <w:r>
+        <w:rPr>
+          <w:rFonts w:hint="default" w:eastAsia="SimSun" w:cs="Times New Roman"/>
+          <w:b w:val="0"/>
+          <w:bCs w:val="0"/>
+          <w:i w:val="0"/>
+          <w:iCs w:val="0"/>
+          <w:color w:val="000000"/>
+          <w:kern w:val="2"/>
+          <w:sz w:val="28"/>
+          <w:szCs w:val="28"/>
+          <w:shd w:val="clear" w:fill="FFFFFF"/>
+          <w:lang w:val="ru-RU" w:eastAsia="zh-CN" w:bidi="ar"/>
+        </w:rPr>
+        <w:t>0</w:t>
+      </w:r>
+      <w:bookmarkStart w:id="0" w:name="_GoBack"/>
+      <w:bookmarkEnd w:id="0"/>
     </w:p>
     <w:p>
       <w:pPr>
         <w:pStyle w:val="8"/>
+        <w:keepNext w:val="0"/>
+        <w:keepLines w:val="0"/>
+        <w:pageBreakBefore w:val="0"/>
+        <w:widowControl w:val="0"/>
         <w:numPr>
           <w:ilvl w:val="2"/>
           <w:numId w:val="1"/>
@@ -1564,9 +1899,19 @@
         <w:tabs>
           <w:tab w:val="left" w:pos="1276"/>
         </w:tabs>
-        <w:spacing w:line="360" w:lineRule="auto"/>
-        <w:ind w:left="0" w:leftChars="0" w:firstLine="700" w:firstLineChars="0"/>
+        <w:kinsoku/>
+        <w:wordWrap/>
+        <w:overflowPunct/>
+        <w:topLinePunct w:val="0"/>
+        <w:autoSpaceDE/>
+        <w:autoSpaceDN/>
+        <w:bidi w:val="0"/>
+        <w:adjustRightInd/>
+        <w:snapToGrid/>
+        <w:spacing w:before="160" w:line="360" w:lineRule="auto"/>
+        <w:ind w:left="0" w:leftChars="0" w:firstLine="697" w:firstLineChars="0"/>
         <w:jc w:val="both"/>
+        <w:textAlignment w:val="auto"/>
         <w:rPr>
           <w:rFonts w:hint="default" w:ascii="Times New Roman Regular" w:hAnsi="Times New Roman Regular" w:cs="Times New Roman Regular"/>
           <w:sz w:val="28"/>
@@ -1871,6 +2216,7 @@
       <w:pPr>
         <w:pStyle w:val="8"/>
         <w:numPr>
+          <w:ilvl w:val="0"/>
           <w:numId w:val="0"/>
         </w:numPr>
         <w:tabs>
@@ -1959,6 +2305,7 @@
       <w:pPr>
         <w:pStyle w:val="8"/>
         <w:numPr>
+          <w:ilvl w:val="0"/>
           <w:numId w:val="0"/>
         </w:numPr>
         <w:tabs>
@@ -3876,6 +4223,7 @@
       <w:jc w:val="left"/>
     </w:pPr>
     <w:rPr>
+      <w:rFonts w:ascii="Times New Roman" w:hAnsi="Times New Roman" w:eastAsia="SimSun" w:cs="Times New Roman"/>
       <w:kern w:val="0"/>
       <w:sz w:val="24"/>
       <w:szCs w:val="24"/>

</xml_diff>